<commit_message>
Align admin roles across system and manuals
</commit_message>
<xml_diff>
--- a/public/downloads/DomainWatch-User-Manual-v2.3.docx
+++ b/public/downloads/DomainWatch-User-Manual-v2.3.docx
@@ -660,7 +660,7 @@
                 <w:rFonts w:ascii="Kanit" w:hAnsi="Kanit" w:eastAsia="Kanit" w:cs="Kanit"/>
                 <w:b/>
               </w:rPr>
-              <w:t>ADMIN</w:t>
+              <w:t>หัวหน้าแอดมิน</w:t>
             </w:r>
           </w:p>
         </w:tc>
@@ -673,7 +673,7 @@
               <w:rPr>
                 <w:rFonts w:ascii="Kanit" w:hAnsi="Kanit" w:eastAsia="Kanit" w:cs="Kanit"/>
               </w:rPr>
-              <w:t>ทุกหน้าและจัดการผู้ใช้</w:t>
+              <w:t>ทำได้ทุกอย่าง รวมผู้ใช้ บริษัท ลิงก์ เคส KPI และเครื่องตรวจ</w:t>
             </w:r>
           </w:p>
         </w:tc>
@@ -702,7 +702,7 @@
                 <w:rFonts w:ascii="Kanit" w:hAnsi="Kanit" w:eastAsia="Kanit" w:cs="Kanit"/>
                 <w:b/>
               </w:rPr>
-              <w:t>ADMIN_LEAD</w:t>
+              <w:t>ผู้ช่วยหัวหน้าแอดมิน</w:t>
             </w:r>
           </w:p>
         </w:tc>
@@ -715,7 +715,7 @@
               <w:rPr>
                 <w:rFonts w:ascii="Kanit" w:hAnsi="Kanit" w:eastAsia="Kanit" w:cs="Kanit"/>
               </w:rPr>
-              <w:t>จัดการเคส/ลิงก์ และดู KPI</w:t>
+              <w:t>จัดการเคส/ลิงก์ และดู KPI แต่จัดการผู้ใช้ไม่ได้</w:t>
             </w:r>
           </w:p>
         </w:tc>
@@ -729,48 +729,6 @@
                 <w:rFonts w:ascii="Kanit" w:hAnsi="Kanit" w:eastAsia="Kanit" w:cs="Kanit"/>
               </w:rPr>
               <w:t>ทุกบริษัท</w:t>
-            </w:r>
-          </w:p>
-        </w:tc>
-      </w:tr>
-      <w:tr>
-        <w:tc>
-          <w:tcPr>
-            <w:tcW w:type="dxa" w:w="2088"/>
-          </w:tcPr>
-          <w:p>
-            <w:r>
-              <w:rPr>
-                <w:rFonts w:ascii="Kanit" w:hAnsi="Kanit" w:eastAsia="Kanit" w:cs="Kanit"/>
-                <w:b/>
-              </w:rPr>
-              <w:t>ADMIN_COMPANY</w:t>
-            </w:r>
-          </w:p>
-        </w:tc>
-        <w:tc>
-          <w:tcPr>
-            <w:tcW w:type="dxa" w:w="5256"/>
-          </w:tcPr>
-          <w:p>
-            <w:r>
-              <w:rPr>
-                <w:rFonts w:ascii="Kanit" w:hAnsi="Kanit" w:eastAsia="Kanit" w:cs="Kanit"/>
-              </w:rPr>
-              <w:t>จัดการเฉพาะบริษัทที่มอบหมาย ไม่เห็น KPI</w:t>
-            </w:r>
-          </w:p>
-        </w:tc>
-        <w:tc>
-          <w:tcPr>
-            <w:tcW w:type="dxa" w:w="2232"/>
-          </w:tcPr>
-          <w:p>
-            <w:r>
-              <w:rPr>
-                <w:rFonts w:ascii="Kanit" w:hAnsi="Kanit" w:eastAsia="Kanit" w:cs="Kanit"/>
-              </w:rPr>
-              <w:t>บริษัทที่ผูกไว้</w:t>
             </w:r>
           </w:p>
         </w:tc>
@@ -2705,7 +2663,7 @@
         <w:rPr>
           <w:rFonts w:ascii="Kanit" w:hAnsi="Kanit" w:eastAsia="Kanit" w:cs="Kanit"/>
         </w:rPr>
-        <w:t>MANAGEMENT อ่านได้อย่างเดียว ส่วน ADMIN_COMPANY ไม่เห็น KPI</w:t>
+        <w:t>MANAGEMENT อ่านได้อย่างเดียว ส่วนผู้ช่วยหัวหน้าแอดมินดู KPI ได้แต่จัดการผู้ใช้ไม่ได้</w:t>
       </w:r>
     </w:p>
     <w:p>

</xml_diff>